<commit_message>
v1.4: method guides rewritten, tools grouped by method
</commit_message>
<xml_diff>
--- a/docs/methods/Method_1_FBA_guide.docx
+++ b/docs/methods/Method_1_FBA_guide.docx
@@ -68,6 +68,11 @@
       <w:r>
         <w:t xml:space="preserve">The answer is not looked up and not fitted. It is the solution of a linear program, solved fresh in every voxel that holds biomass, at every time step.</w:t>
       </w:r>
+    </w:p>
+    <w:p>
+      <w:pPr>
+        <w:spacing w:after="60"/>
+      </w:pPr>
     </w:p>
     <w:tbl>
       <w:tblPr>
@@ -582,70 +587,6 @@
     </w:p>
     <w:p>
       <w:pPr>
-        <w:spacing w:before="140" w:after="40"/>
-        <w:jc w:val="center"/>
-      </w:pPr>
-      <w:r>
-        <w:rPr>
-          <w:noProof/>
-        </w:rPr>
-        <w:drawing>
-          <wp:inline distT="0" distB="0" distL="0" distR="0">
-            <wp:extent cx="5669280" cy="4148772"/>
-            <wp:effectExtent l="0" t="0" r="0" b="0"/>
-            <wp:docPr id="900" name="Picture 900"/>
-            <wp:cNvGraphicFramePr>
-              <a:graphicFrameLocks xmlns:a="http://schemas.openxmlformats.org/drawingml/2006/main" noChangeAspect="1"/>
-            </wp:cNvGraphicFramePr>
-            <a:graphic xmlns:a="http://schemas.openxmlformats.org/drawingml/2006/main">
-              <a:graphicData uri="http://schemas.openxmlformats.org/drawingml/2006/picture">
-                <pic:pic xmlns:pic="http://schemas.openxmlformats.org/drawingml/2006/picture">
-                  <pic:nvPicPr>
-                    <pic:cNvPr id="0" name=""/>
-                    <pic:cNvPicPr>
-                      <a:picLocks noChangeAspect="1" noChangeArrowheads="1"/>
-                    </pic:cNvPicPr>
-                  </pic:nvPicPr>
-                  <pic:blipFill>
-                    <a:blip r:embed="rId24"/>
-                    <a:srcRect/>
-                    <a:stretch>
-                      <a:fillRect/>
-                    </a:stretch>
-                  </pic:blipFill>
-                  <pic:spPr bwMode="auto">
-                    <a:xfrm>
-                      <a:off x="0" y="0"/>
-                      <a:ext cx="5669280" cy="4148772"/>
-                    </a:xfrm>
-                    <a:prstGeom prst="rect">
-                      <a:avLst/>
-                    </a:prstGeom>
-                  </pic:spPr>
-                </pic:pic>
-              </a:graphicData>
-            </a:graphic>
-          </wp:inline>
-        </w:drawing>
-      </w:r>
-    </w:p>
-    <w:p>
-      <w:pPr>
-        <w:spacing w:after="120"/>
-        <w:jc w:val="both"/>
-      </w:pPr>
-      <w:r>
-        <w:rPr>
-          <w:i/>
-          <w:iCs/>
-          <w:sz w:val="18"/>
-          <w:szCs w:val="18"/>
-        </w:rPr>
-        <w:t xml:space="preserve">Figure 2. How this method works, end to end, and where each number enters. The three bands are the whole point: the green band is work a person does before any simulation exists, the grey band is work the solver does once at start-up, and the red band is the loop that runs in every voxel at every reaction step. Each row names what arrives, what is done to it, and what leaves. (a) The metabolic model is a property of the organism, not of the simulation: it is a list of the reactions the cell can run, taken from a database or reconstructed, and it is written once. (b) Optionally it is flattened to plain arrays, which removes the need to parse chemical markup at start-up but changes nothing about the model. (c) At start-up the solver reads that model and matches each of its exchange reactions to one of the substrates the simulation transports, by name. A substrate the organism does not exchange is marked absent rather than silently paired with the wrong reaction. (d) The problem object is built once and reused for the whole run, which is what makes solving a linear program in every voxel affordable at all. (e) The loop begins. The solver reads what this voxel holds: one concentration per substrate, and the biomass present. (f) Each concentration becomes an uptake CEILING through the Michaelis-Menten expression, in millimoles per gram of dry cells per hour. This is the only row that differs between one voxel and the next, and therefore the only place the local condition enters. (g) The program is solved: make growth as large as possible subject to nothing accumulating inside the cell, and subject to those ceilings. What comes back is a flux for every reaction, growth included. Note that the stoichiometry is an output here, not an input: the ratio in which the substrates are consumed is whatever the optimum required, and it can change from voxel to voxel. (h) The fluxes are converted into the units the transport solver works in, using the biomass present, its molar mass and the length of the step. Those increments are what the next transport step carries away.</w:t>
-      </w:r>
-    </w:p>
-    <w:p>
-      <w:pPr>
         <w:spacing w:after="140" w:line="288" w:lineRule="auto"/>
       </w:pPr>
       <w:r>
@@ -733,7 +674,7 @@
           <w:sz w:val="18"/>
           <w:szCs w:val="18"/>
         </w:rPr>
-        <w:t xml:space="preserve">Figure 3. The program, block by block. Only the third block carries anything that changes from one voxel to the next.</w:t>
+        <w:t xml:space="preserve">Figure 2. The program, block by block. Only the third block carries anything that changes from one voxel to the next.</w:t>
       </w:r>
     </w:p>
     <w:p>
@@ -1019,70 +960,6 @@
       </w:pPr>
       <w:r>
         <w:t xml:space="preserve">The flux on each exchange reaction, scaled by biomass and the time step, is the source term for that species — negative where it was consumed, positive where it was released.</w:t>
-      </w:r>
-    </w:p>
-    <w:p>
-      <w:pPr>
-        <w:spacing w:before="140" w:after="40"/>
-        <w:jc w:val="center"/>
-      </w:pPr>
-      <w:r>
-        <w:rPr>
-          <w:noProof/>
-        </w:rPr>
-        <w:drawing>
-          <wp:inline distT="0" distB="0" distL="0" distR="0">
-            <wp:extent cx="5669280" cy="4618615"/>
-            <wp:effectExtent l="0" t="0" r="0" b="0"/>
-            <wp:docPr id="103" name="Picture 103"/>
-            <wp:cNvGraphicFramePr>
-              <a:graphicFrameLocks xmlns:a="http://schemas.openxmlformats.org/drawingml/2006/main" noChangeAspect="1"/>
-            </wp:cNvGraphicFramePr>
-            <a:graphic xmlns:a="http://schemas.openxmlformats.org/drawingml/2006/main">
-              <a:graphicData uri="http://schemas.openxmlformats.org/drawingml/2006/picture">
-                <pic:pic xmlns:pic="http://schemas.openxmlformats.org/drawingml/2006/picture">
-                  <pic:nvPicPr>
-                    <pic:cNvPr id="0" name=""/>
-                    <pic:cNvPicPr>
-                      <a:picLocks noChangeAspect="1" noChangeArrowheads="1"/>
-                    </pic:cNvPicPr>
-                  </pic:nvPicPr>
-                  <pic:blipFill>
-                    <a:blip r:embed="rId15"/>
-                    <a:srcRect/>
-                    <a:stretch>
-                      <a:fillRect/>
-                    </a:stretch>
-                  </pic:blipFill>
-                  <pic:spPr bwMode="auto">
-                    <a:xfrm>
-                      <a:off x="0" y="0"/>
-                      <a:ext cx="5669280" cy="4618615"/>
-                    </a:xfrm>
-                    <a:prstGeom prst="rect">
-                      <a:avLst/>
-                    </a:prstGeom>
-                  </pic:spPr>
-                </pic:pic>
-              </a:graphicData>
-            </a:graphic>
-          </wp:inline>
-        </w:drawing>
-      </w:r>
-    </w:p>
-    <w:p>
-      <w:pPr>
-        <w:spacing w:after="120"/>
-        <w:jc w:val="center"/>
-      </w:pPr>
-      <w:r>
-        <w:rPr>
-          <w:i/>
-          <w:iCs/>
-          <w:sz w:val="18"/>
-          <w:szCs w:val="18"/>
-        </w:rPr>
-        <w:t xml:space="preserve">Figure 4. One voxel, end to end: what transport delivered, the bounds that built, what the solver returned, and what went back to transport.</w:t>
       </w:r>
     </w:p>
     <w:p>
@@ -1168,7 +1045,7 @@
           <w:sz w:val="18"/>
           <w:szCs w:val="18"/>
         </w:rPr>
-        <w:t xml:space="preserve">Figure 5. The solve loop. The biotic reaction step is highlighted; flux balance analysis is one of the interchangeable things that step can be.</w:t>
+        <w:t xml:space="preserve">Figure 3. The solve loop. The biotic reaction step is highlighted; flux balance analysis is one of the interchangeable things that step can be.</w:t>
       </w:r>
     </w:p>
     <w:p>
@@ -1212,9 +1089,9 @@
         </w:rPr>
         <w:drawing>
           <wp:inline distT="0" distB="0" distL="0" distR="0">
-            <wp:extent cx="5943600" cy="4394758"/>
+            <wp:extent cx="4450000" cy="6464211"/>
             <wp:effectExtent l="0" t="0" r="0" b="0"/>
-            <wp:docPr id="105" name="Picture 105"/>
+            <wp:docPr id="641" name="Picture 641"/>
             <wp:cNvGraphicFramePr>
               <a:graphicFrameLocks xmlns:a="http://schemas.openxmlformats.org/drawingml/2006/main" noChangeAspect="1"/>
             </wp:cNvGraphicFramePr>
@@ -1223,13 +1100,10 @@
                 <pic:pic xmlns:pic="http://schemas.openxmlformats.org/drawingml/2006/picture">
                   <pic:nvPicPr>
                     <pic:cNvPr id="0" name=""/>
-                    <pic:cNvPicPr>
-                      <a:picLocks noChangeAspect="1" noChangeArrowheads="1"/>
-                    </pic:cNvPicPr>
+                    <pic:cNvPicPr/>
                   </pic:nvPicPr>
                   <pic:blipFill>
-                    <a:blip r:embed="rId17"/>
-                    <a:srcRect/>
+                    <a:blip r:embed="rId90"/>
                     <a:stretch>
                       <a:fillRect/>
                     </a:stretch>
@@ -1237,7 +1111,7 @@
                   <pic:spPr bwMode="auto">
                     <a:xfrm>
                       <a:off x="0" y="0"/>
-                      <a:ext cx="5943600" cy="4394758"/>
+                      <a:ext cx="4450000" cy="6464211"/>
                     </a:xfrm>
                     <a:prstGeom prst="rect">
                       <a:avLst/>
@@ -1262,7 +1136,15 @@
           <w:sz w:val="18"/>
           <w:szCs w:val="18"/>
         </w:rPr>
-        <w:t xml:space="preserve">Figure 6. Pipeline a — GLPK, step by step. What each stage receives, what it does, and what it leaves. Steps 1 to 4 happen once; steps 5 to 8 happen in every voxel that holds biomass, at every step.</w:t>
+        <w:t xml:space="preserve">Figure 4. The flux balance path as code, from a metabolic model on disk to a change in one voxel. The side panels open the two steps that are otherwise taken on trust: what the program actually says, and why the answer is sometimes solved again.</w:t>
+      </w:r>
+    </w:p>
+    <w:p>
+      <w:pPr>
+        <w:spacing w:after="140" w:line="288" w:lineRule="auto"/>
+      </w:pPr>
+      <w:r>
+        <w:t xml:space="preserve">The three bands are three different time scales, and the shape of them is the reason this method is affordable at all. The yellow band happens once, before any simulation exists, and none of it is code. The blue band happens once when the solver starts, and it is where the expensive part is paid for: the matrix, the fixed bounds and the objective are the same in every voxel of every step, so they are turned into one problem object that survives the whole run. The green band happens in every wet voxel that holds biomass, at every reaction step, and it is the box drawn in red in Figure 3. What it does to that problem object is small: it moves one number per substrate, solves, and reads two things back. The purple box is the only step where the two back ends differ, and they differ in cost rather than in answer, which is what makes a disagreement between them a defect in one of the couplings rather than a property of either solver. The two boxes drawn in red are the two places where a mistake would otherwise be silent: a substrate the model has no column for would be consumed by nothing for the whole run, and two organisms in one voxel would each be granted the whole supply unless their draws were added up afterwards and checked.</w:t>
       </w:r>
     </w:p>
     <w:p>
@@ -1279,78 +1161,6 @@
       </w:pPr>
       <w:r>
         <w:t xml:space="preserve">Per voxel there are only three things to do: read the concentrations, form the uptake bounds from equation (3), and solve. The matrix, the capacities and the objective are the same program the previous voxel solved, so the simplex restarts from the basis it left there and finishes in a handful of pivots — about 0.1 ms.</w:t>
-      </w:r>
-    </w:p>
-    <w:p>
-      <w:pPr>
-        <w:spacing w:before="140" w:after="40"/>
-        <w:jc w:val="center"/>
-      </w:pPr>
-      <w:r>
-        <w:rPr>
-          <w:noProof/>
-        </w:rPr>
-        <w:drawing>
-          <wp:inline distT="0" distB="0" distL="0" distR="0">
-            <wp:extent cx="5943600" cy="4215883"/>
-            <wp:effectExtent l="0" t="0" r="0" b="0"/>
-            <wp:docPr id="106" name="Picture 106"/>
-            <wp:cNvGraphicFramePr>
-              <a:graphicFrameLocks xmlns:a="http://schemas.openxmlformats.org/drawingml/2006/main" noChangeAspect="1"/>
-            </wp:cNvGraphicFramePr>
-            <a:graphic xmlns:a="http://schemas.openxmlformats.org/drawingml/2006/main">
-              <a:graphicData uri="http://schemas.openxmlformats.org/drawingml/2006/picture">
-                <pic:pic xmlns:pic="http://schemas.openxmlformats.org/drawingml/2006/picture">
-                  <pic:nvPicPr>
-                    <pic:cNvPr id="0" name=""/>
-                    <pic:cNvPicPr>
-                      <a:picLocks noChangeAspect="1" noChangeArrowheads="1"/>
-                    </pic:cNvPicPr>
-                  </pic:nvPicPr>
-                  <pic:blipFill>
-                    <a:blip r:embed="rId18"/>
-                    <a:srcRect/>
-                    <a:stretch>
-                      <a:fillRect/>
-                    </a:stretch>
-                  </pic:blipFill>
-                  <pic:spPr bwMode="auto">
-                    <a:xfrm>
-                      <a:off x="0" y="0"/>
-                      <a:ext cx="5943600" cy="4215883"/>
-                    </a:xfrm>
-                    <a:prstGeom prst="rect">
-                      <a:avLst/>
-                    </a:prstGeom>
-                  </pic:spPr>
-                </pic:pic>
-              </a:graphicData>
-            </a:graphic>
-          </wp:inline>
-        </w:drawing>
-      </w:r>
-    </w:p>
-    <w:p>
-      <w:pPr>
-        <w:spacing w:after="120"/>
-        <w:jc w:val="center"/>
-      </w:pPr>
-      <w:r>
-        <w:rPr>
-          <w:i/>
-          <w:iCs/>
-          <w:sz w:val="18"/>
-          <w:szCs w:val="18"/>
-        </w:rPr>
-        <w:t xml:space="preserve">Figure 7. The same pipeline with numbers in it, on the network of Figure 1. Left: what is built once. Middle: the two numbers this voxel changes. Right: what the solve returns. These are the actual solutions at those bounds.</w:t>
-      </w:r>
-    </w:p>
-    <w:p>
-      <w:pPr>
-        <w:spacing w:after="140" w:line="288" w:lineRule="auto"/>
-      </w:pPr>
-      <w:r>
-        <w:t xml:space="preserve">Figure 7 is small enough to check by hand. Row B of the matrix says the first internal reaction runs at exactly the rate substrate b is taken up; row C carries that into the objective. So growth is set by whichever uptake bound binds first, and the spare capacity on the other substrate leaves through an exchange.</w:t>
       </w:r>
     </w:p>
     <w:p>
@@ -1377,70 +1187,6 @@
     </w:p>
     <w:p>
       <w:pPr>
-        <w:spacing w:before="140" w:after="40"/>
-        <w:jc w:val="center"/>
-      </w:pPr>
-      <w:r>
-        <w:rPr>
-          <w:noProof/>
-        </w:rPr>
-        <w:drawing>
-          <wp:inline distT="0" distB="0" distL="0" distR="0">
-            <wp:extent cx="5943600" cy="4397116"/>
-            <wp:effectExtent l="0" t="0" r="0" b="0"/>
-            <wp:docPr id="107" name="Picture 107"/>
-            <wp:cNvGraphicFramePr>
-              <a:graphicFrameLocks xmlns:a="http://schemas.openxmlformats.org/drawingml/2006/main" noChangeAspect="1"/>
-            </wp:cNvGraphicFramePr>
-            <a:graphic xmlns:a="http://schemas.openxmlformats.org/drawingml/2006/main">
-              <a:graphicData uri="http://schemas.openxmlformats.org/drawingml/2006/picture">
-                <pic:pic xmlns:pic="http://schemas.openxmlformats.org/drawingml/2006/picture">
-                  <pic:nvPicPr>
-                    <pic:cNvPr id="0" name=""/>
-                    <pic:cNvPicPr>
-                      <a:picLocks noChangeAspect="1" noChangeArrowheads="1"/>
-                    </pic:cNvPicPr>
-                  </pic:nvPicPr>
-                  <pic:blipFill>
-                    <a:blip r:embed="rId19"/>
-                    <a:srcRect/>
-                    <a:stretch>
-                      <a:fillRect/>
-                    </a:stretch>
-                  </pic:blipFill>
-                  <pic:spPr bwMode="auto">
-                    <a:xfrm>
-                      <a:off x="0" y="0"/>
-                      <a:ext cx="5943600" cy="4397116"/>
-                    </a:xfrm>
-                    <a:prstGeom prst="rect">
-                      <a:avLst/>
-                    </a:prstGeom>
-                  </pic:spPr>
-                </pic:pic>
-              </a:graphicData>
-            </a:graphic>
-          </wp:inline>
-        </w:drawing>
-      </w:r>
-    </w:p>
-    <w:p>
-      <w:pPr>
-        <w:spacing w:after="120"/>
-        <w:jc w:val="center"/>
-      </w:pPr>
-      <w:r>
-        <w:rPr>
-          <w:i/>
-          <w:iCs/>
-          <w:sz w:val="18"/>
-          <w:szCs w:val="18"/>
-        </w:rPr>
-        <w:t xml:space="preserve">Figure 8. Pipeline b — COBRApy, step by step. The same eight stages, with one difference that changes the cost of all of them: stage 7 crosses into a Python interpreter and back on every voxel.</w:t>
-      </w:r>
-    </w:p>
-    <w:p>
-      <w:pPr>
         <w:spacing w:after="140" w:line="288" w:lineRule="auto"/>
       </w:pPr>
       <w:r>
@@ -1454,6 +1200,11 @@
       <w:r>
         <w:t xml:space="preserve">Per voxel the bounds are packed into a list, sent across the language boundary, solved, and the fluxes unpacked on the way back. No basis is kept between calls, so each solve starts cold: about 1 ms, an order of magnitude more than GLPK.</w:t>
       </w:r>
+    </w:p>
+    <w:p>
+      <w:pPr>
+        <w:spacing w:after="60"/>
+      </w:pPr>
     </w:p>
     <w:tbl>
       <w:tblPr>
@@ -1908,6 +1659,8 @@
     </w:p>
     <w:p>
       <w:pPr>
+        <w:keepNext/>
+        <w:keepLines/>
         <w:spacing w:line="252" w:lineRule="auto"/>
       </w:pPr>
       <w:r>
@@ -1921,6 +1674,8 @@
     </w:p>
     <w:p>
       <w:pPr>
+        <w:keepNext/>
+        <w:keepLines/>
         <w:spacing w:line="252" w:lineRule="auto"/>
       </w:pPr>
       <w:r>
@@ -1934,6 +1689,8 @@
     </w:p>
     <w:p>
       <w:pPr>
+        <w:keepNext/>
+        <w:keepLines/>
         <w:spacing w:line="252" w:lineRule="auto"/>
       </w:pPr>
       <w:r>
@@ -1958,7 +1715,6 @@
         <w:t xml:space="preserve">                                       v[product 1] &gt;= a2 f2</w:t>
       </w:r>
     </w:p>
-    <w:p/>
     <w:p>
       <w:pPr>
         <w:spacing w:before="140" w:after="40"/>
@@ -1970,9 +1726,9 @@
         </w:rPr>
         <w:drawing>
           <wp:inline distT="0" distB="0" distL="0" distR="0">
-            <wp:extent cx="5943600" cy="4232226"/>
+            <wp:extent cx="4600000" cy="5762105"/>
             <wp:effectExtent l="0" t="0" r="0" b="0"/>
-            <wp:docPr id="108" name="Picture 108"/>
+            <wp:docPr id="642" name="Picture 642"/>
             <wp:cNvGraphicFramePr>
               <a:graphicFrameLocks xmlns:a="http://schemas.openxmlformats.org/drawingml/2006/main" noChangeAspect="1"/>
             </wp:cNvGraphicFramePr>
@@ -1981,13 +1737,10 @@
                 <pic:pic xmlns:pic="http://schemas.openxmlformats.org/drawingml/2006/picture">
                   <pic:nvPicPr>
                     <pic:cNvPr id="0" name=""/>
-                    <pic:cNvPicPr>
-                      <a:picLocks noChangeAspect="1" noChangeArrowheads="1"/>
-                    </pic:cNvPicPr>
+                    <pic:cNvPicPr/>
                   </pic:nvPicPr>
                   <pic:blipFill>
-                    <a:blip r:embed="rId20"/>
-                    <a:srcRect/>
+                    <a:blip r:embed="rId92"/>
                     <a:stretch>
                       <a:fillRect/>
                     </a:stretch>
@@ -1995,7 +1748,7 @@
                   <pic:spPr bwMode="auto">
                     <a:xfrm>
                       <a:off x="0" y="0"/>
-                      <a:ext cx="5943600" cy="4232226"/>
+                      <a:ext cx="4600000" cy="5762105"/>
                     </a:xfrm>
                     <a:prstGeom prst="rect">
                       <a:avLst/>
@@ -2020,7 +1773,15 @@
           <w:sz w:val="18"/>
           <w:szCs w:val="18"/>
         </w:rPr>
-        <w:t xml:space="preserve">Figure 9. Pipeline c — the chain, step by step. It replaces the single solve inside pipeline a or b; everything around it is unchanged.</w:t>
+        <w:t xml:space="preserve">Figure 5. The two refinements of the solve step, as code. Neither replaces the method of Figure 4: the first replaces the single program inside it with a chain, and the second wraps whichever solve is configured and runs it once per carbon source.</w:t>
+      </w:r>
+    </w:p>
+    <w:p>
+      <w:pPr>
+        <w:spacing w:after="140" w:line="288" w:lineRule="auto"/>
+      </w:pPr>
+      <w:r>
+        <w:t xml:space="preserve">They answer two different complaints, and they can be used together. The chain answers the one about reproducibility: a single program pins the growth rate but often leaves the individual exchange fluxes free to trade against one another, and the solver returns whichever member of that set its pivoting rule reached. Each stage of the chain pins one more quantity until nothing is free. The competition answers the one about behaviour: an organism offered several substrates eats the best one and switches when it runs out, which no single program and no rate law will do on its own. The two boxes drawn in red are the places where each one goes quietly wrong. In the chain, the growth rate must be read out of the last stage's flux vector rather than the first stage's optimum, because with any retain fraction below one those two are different numbers and reporting the first while handing back the second's fluxes stops mass balancing. In the competition, shutting an option means forbidding its substrate's uptake and never its release, because the compound one option excretes is what the next option will live on.</w:t>
       </w:r>
     </w:p>
     <w:p>
@@ -2092,71 +1853,7 @@
           <w:sz w:val="18"/>
           <w:szCs w:val="18"/>
         </w:rPr>
-        <w:t xml:space="preserve">Figure 10. The chain on the network of Figure 1. Top left: what one program leaves free. Top middle: the two stages. Top right: the determined answer. Below: what lowering the retain fraction buys, and where growth must be read from.</w:t>
-      </w:r>
-    </w:p>
-    <w:p>
-      <w:pPr>
-        <w:spacing w:before="140" w:after="40"/>
-        <w:jc w:val="center"/>
-      </w:pPr>
-      <w:r>
-        <w:rPr>
-          <w:noProof/>
-        </w:rPr>
-        <w:drawing>
-          <wp:inline distT="0" distB="0" distL="0" distR="0">
-            <wp:extent cx="5669280" cy="4155445"/>
-            <wp:effectExtent l="0" t="0" r="0" b="0"/>
-            <wp:docPr id="910" name="Picture 910"/>
-            <wp:cNvGraphicFramePr>
-              <a:graphicFrameLocks xmlns:a="http://schemas.openxmlformats.org/drawingml/2006/main" noChangeAspect="1"/>
-            </wp:cNvGraphicFramePr>
-            <a:graphic xmlns:a="http://schemas.openxmlformats.org/drawingml/2006/main">
-              <a:graphicData uri="http://schemas.openxmlformats.org/drawingml/2006/picture">
-                <pic:pic xmlns:pic="http://schemas.openxmlformats.org/drawingml/2006/picture">
-                  <pic:nvPicPr>
-                    <pic:cNvPr id="0" name=""/>
-                    <pic:cNvPicPr>
-                      <a:picLocks noChangeAspect="1" noChangeArrowheads="1"/>
-                    </pic:cNvPicPr>
-                  </pic:nvPicPr>
-                  <pic:blipFill>
-                    <a:blip r:embed="rId25"/>
-                    <a:srcRect/>
-                    <a:stretch>
-                      <a:fillRect/>
-                    </a:stretch>
-                  </pic:blipFill>
-                  <pic:spPr bwMode="auto">
-                    <a:xfrm>
-                      <a:off x="0" y="0"/>
-                      <a:ext cx="5669280" cy="4155445"/>
-                    </a:xfrm>
-                    <a:prstGeom prst="rect">
-                      <a:avLst/>
-                    </a:prstGeom>
-                  </pic:spPr>
-                </pic:pic>
-              </a:graphicData>
-            </a:graphic>
-          </wp:inline>
-        </w:drawing>
-      </w:r>
-    </w:p>
-    <w:p>
-      <w:pPr>
-        <w:spacing w:after="120"/>
-        <w:jc w:val="both"/>
-      </w:pPr>
-      <w:r>
-        <w:rPr>
-          <w:i/>
-          <w:iCs/>
-          <w:sz w:val="18"/>
-          <w:szCs w:val="18"/>
-        </w:rPr>
-        <w:t xml:space="preserve">Figure 11. Multi-step flux balance analysis, end to end. The green band is work done before any simulation exists, the grey band is done once at start-up, and the red band runs in every voxel at every reaction step. (a) The chain needs a model whose reactions carry NAMES rather than a flattened matrix, because a stage is identified by the reaction it optimises and a column index stops meaning anything the moment the model file is regenerated. (b) The order is a modelling decision, not a numerical one: growth first, then the products the study actually reports, in the order they matter. (c) At start-up each stage name is resolved against the model. A mistyped name stops the run there with a suggestion, which is the whole reason names are preferred to indices. (d) The loop begins, and this row is identical to a single program: the chain changes nothing about how the local condition enters. (e) Stage 1 maximises growth and returns mu*, exactly as ordinary flux balance analysis would. (f) That optimum is then PINNED as a constraint, v[growth] at least a1 times mu*, and the next stage maximises the first product subject to it. (g) Each further stage pins everything before it. After the last one nothing is free, so the same model at the same bounds returns the same numbers on any solver, every time. That is the point of the method: a single program leaves the by-product fluxes free to trade against one another and the solver returns whichever end its pivoting rule reached. (h) The row in red is the one implementation detail that matters. Growth handed back to transport must be read out of the LAST stage's flux vector, never from the first stage's objective value. With every retain fraction at 1.0 the two are equal, so a version that confuses them passes the obvious test; below 1.0 they diverge by exactly what the calibration gave away.</w:t>
+        <w:t xml:space="preserve">Figure 6. The chain on the network of Figure 1. Top left: what one program leaves free. Top middle: the two stages. Top right: the determined answer. Below: what lowering the retain fraction buys, and where growth must be read from.</w:t>
       </w:r>
     </w:p>
     <w:p>
@@ -2321,7 +2018,7 @@
         <w:spacing w:after="140" w:line="288" w:lineRule="auto"/>
       </w:pPr>
       <w:r>
-        <w:t xml:space="preserve">At a fraction of one those two are equal, so an implementation that confuses them passes the obvious test. Below one they diverge by exactly as much as the calibration gave away — on the small network of Figure 10, at a fraction of 0.8, the first stage says 3.6364 while the vector actually chosen grows at 2.9091. Reporting the first while handing back the second's fluxes would add biomass 25 per cent faster than the fluxes being used. Mass would stop balancing, and nothing in the output would say so.</w:t>
+        <w:t xml:space="preserve">At a fraction of one those two are equal, so an implementation that confuses them passes the obvious test. Below one they diverge by exactly as much as the calibration gave away — on the small network of Figure 6, at a fraction of 0.8, the first stage says 3.6364 while the vector actually chosen grows at 2.9091. Reporting the first while handing back the second's fluxes would add biomass 25 per cent faster than the fluxes being used. Mass would stop balancing, and nothing in the output would say so.</w:t>
       </w:r>
     </w:p>
     <w:p>
@@ -2659,70 +2356,6 @@
           <w:szCs w:val="24"/>
         </w:rPr>
         <w:t xml:space="preserve">        (7)</w:t>
-      </w:r>
-    </w:p>
-    <w:p>
-      <w:pPr>
-        <w:spacing w:before="140" w:after="40"/>
-        <w:jc w:val="center"/>
-      </w:pPr>
-      <w:r>
-        <w:rPr>
-          <w:noProof/>
-        </w:rPr>
-        <w:drawing>
-          <wp:inline distT="0" distB="0" distL="0" distR="0">
-            <wp:extent cx="5943600" cy="4467266"/>
-            <wp:effectExtent l="0" t="0" r="0" b="0"/>
-            <wp:docPr id="110" name="Picture 110"/>
-            <wp:cNvGraphicFramePr>
-              <a:graphicFrameLocks xmlns:a="http://schemas.openxmlformats.org/drawingml/2006/main" noChangeAspect="1"/>
-            </wp:cNvGraphicFramePr>
-            <a:graphic xmlns:a="http://schemas.openxmlformats.org/drawingml/2006/main">
-              <a:graphicData uri="http://schemas.openxmlformats.org/drawingml/2006/picture">
-                <pic:pic xmlns:pic="http://schemas.openxmlformats.org/drawingml/2006/picture">
-                  <pic:nvPicPr>
-                    <pic:cNvPr id="0" name=""/>
-                    <pic:cNvPicPr>
-                      <a:picLocks noChangeAspect="1" noChangeArrowheads="1"/>
-                    </pic:cNvPicPr>
-                  </pic:nvPicPr>
-                  <pic:blipFill>
-                    <a:blip r:embed="rId22"/>
-                    <a:srcRect/>
-                    <a:stretch>
-                      <a:fillRect/>
-                    </a:stretch>
-                  </pic:blipFill>
-                  <pic:spPr bwMode="auto">
-                    <a:xfrm>
-                      <a:off x="0" y="0"/>
-                      <a:ext cx="5943600" cy="4467266"/>
-                    </a:xfrm>
-                    <a:prstGeom prst="rect">
-                      <a:avLst/>
-                    </a:prstGeom>
-                  </pic:spPr>
-                </pic:pic>
-              </a:graphicData>
-            </a:graphic>
-          </wp:inline>
-        </w:drawing>
-      </w:r>
-    </w:p>
-    <w:p>
-      <w:pPr>
-        <w:spacing w:after="120"/>
-        <w:jc w:val="center"/>
-      </w:pPr>
-      <w:r>
-        <w:rPr>
-          <w:i/>
-          <w:iCs/>
-          <w:sz w:val="18"/>
-          <w:szCs w:val="18"/>
-        </w:rPr>
-        <w:t xml:space="preserve">Figure 12. Pipeline d — the competition, step by step. It wraps pipeline a, b or c rather than replacing it: each option is solved by whichever is configured, and this layer only decides how much each option counts.</w:t>
       </w:r>
     </w:p>
     <w:p>
@@ -2786,71 +2419,7 @@
           <w:sz w:val="18"/>
           <w:szCs w:val="18"/>
         </w:rPr>
-        <w:t xml:space="preserve">Figure 13. The competition on a network where the donor's by-product can itself be eaten. Top: the network, both options solved alone, and the weights. Below: the blend as the donor runs out, with the release flux changing sign on its own.</w:t>
-      </w:r>
-    </w:p>
-    <w:p>
-      <w:pPr>
-        <w:spacing w:before="140" w:after="40"/>
-        <w:jc w:val="center"/>
-      </w:pPr>
-      <w:r>
-        <w:rPr>
-          <w:noProof/>
-        </w:rPr>
-        <w:drawing>
-          <wp:inline distT="0" distB="0" distL="0" distR="0">
-            <wp:extent cx="5669280" cy="3812940"/>
-            <wp:effectExtent l="0" t="0" r="0" b="0"/>
-            <wp:docPr id="911" name="Picture 911"/>
-            <wp:cNvGraphicFramePr>
-              <a:graphicFrameLocks xmlns:a="http://schemas.openxmlformats.org/drawingml/2006/main" noChangeAspect="1"/>
-            </wp:cNvGraphicFramePr>
-            <a:graphic xmlns:a="http://schemas.openxmlformats.org/drawingml/2006/main">
-              <a:graphicData uri="http://schemas.openxmlformats.org/drawingml/2006/picture">
-                <pic:pic xmlns:pic="http://schemas.openxmlformats.org/drawingml/2006/picture">
-                  <pic:nvPicPr>
-                    <pic:cNvPr id="0" name=""/>
-                    <pic:cNvPicPr>
-                      <a:picLocks noChangeAspect="1" noChangeArrowheads="1"/>
-                    </pic:cNvPicPr>
-                  </pic:nvPicPr>
-                  <pic:blipFill>
-                    <a:blip r:embed="rId26"/>
-                    <a:srcRect/>
-                    <a:stretch>
-                      <a:fillRect/>
-                    </a:stretch>
-                  </pic:blipFill>
-                  <pic:spPr bwMode="auto">
-                    <a:xfrm>
-                      <a:off x="0" y="0"/>
-                      <a:ext cx="5669280" cy="3812940"/>
-                    </a:xfrm>
-                    <a:prstGeom prst="rect">
-                      <a:avLst/>
-                    </a:prstGeom>
-                  </pic:spPr>
-                </pic:pic>
-              </a:graphicData>
-            </a:graphic>
-          </wp:inline>
-        </w:drawing>
-      </w:r>
-    </w:p>
-    <w:p>
-      <w:pPr>
-        <w:spacing w:after="120"/>
-        <w:jc w:val="both"/>
-      </w:pPr>
-      <w:r>
-        <w:rPr>
-          <w:i/>
-          <w:iCs/>
-          <w:sz w:val="18"/>
-          <w:szCs w:val="18"/>
-        </w:rPr>
-        <w:t xml:space="preserve">Figure 14. Cybernetic substrate switching, end to end. The bands are the same three. (a) The offline decision is which of the organism's substrates are carbon sources it could live on. Each becomes a growth OPTION, and the carbon each molecule carries is what makes the competition about carbon rather than about molecules: glucose brings six, acetate two. (b) A Monod rate per source sets the WEIGHTS only. The flux actually realised still comes from the model, so these two numbers do not become a hidden rate law. (c) At start-up the exclusion sets are DERIVED rather than written out: for each option, which other sources must be shut. Writing them by hand invites leaving one open, and an open second carbon source destroys the switching silently. (d) The loop begins by scoring every option from the local concentrations. The weight of an option is its carbon uptake as a fraction of the total carbon uptake on offer. (e) An option whose weight falls below the floor is not solved at all. This is what keeps the cost near that of a single program rather than one program per source. (f) Each remaining option is solved with the OTHER sources' uptake shut, in red because the detail is easy to get wrong: shutting a source must forbid its UPTAKE and never its release. An organism growing on glucose has to stay free to excrete the acetate that the other option will later consume, and closing the exchange outright would remove the very thing being switched to. (g) The flux vectors are blended by their weights. That averaging is safe here for a specific reason: each vector satisfies S v = 0, and a convex combination of vectors in the null space of S is itself in that null space, so the blend conserves mass exactly rather than approximately. Averaging model outputs is not usually safe; this is why it is here.</w:t>
+        <w:t xml:space="preserve">Figure 7. The competition on a network where the donor's by-product can itself be eaten. Top: the network, both options solved alone, and the weights. Below: the blend as the donor runs out, with the release flux changing sign on its own.</w:t>
       </w:r>
     </w:p>
     <w:p>
@@ -2980,7 +2549,7 @@
         <w:spacing w:after="140" w:line="288" w:lineRule="auto"/>
       </w:pPr>
       <w:r>
-        <w:t xml:space="preserve">Figure 13 is the whole mechanism on a network small enough to verify. One option grows fast and RELEASES the by-product; the other grows slowly and CONSUMES it. Neither is the organism's behaviour — the blend is, and the blend moves as the donor depletes.</w:t>
+        <w:t xml:space="preserve">Figure 7 is the whole mechanism on a network small enough to verify. One option grows fast and RELEASES the by-product; the other grows slowly and CONSUMES it. Neither is the organism's behaviour — the blend is, and the blend moves as the donor depletes.</w:t>
       </w:r>
     </w:p>
     <w:p>
@@ -3039,6 +2608,842 @@
     </w:p>
     <w:p>
       <w:pPr>
+        <w:spacing w:before="160" w:after="80"/>
+      </w:pPr>
+      <w:r>
+        <w:rPr>
+          <w:b/>
+          <w:bCs/>
+        </w:rPr>
+        <w:t xml:space="preserve">8.  Every equation, in the order the code applies them</w:t>
+      </w:r>
+    </w:p>
+    <w:p>
+      <w:pPr>
+        <w:spacing w:before="160" w:after="80"/>
+      </w:pPr>
+      <w:r>
+        <w:rPr>
+          <w:b/>
+          <w:bCs/>
+        </w:rPr>
+        <w:t xml:space="preserve">8.1  The four equations the sections above do not write down</w:t>
+      </w:r>
+    </w:p>
+    <w:p>
+      <w:pPr>
+        <w:spacing w:after="140" w:line="288" w:lineRule="auto"/>
+      </w:pPr>
+      <w:r>
+        <w:t xml:space="preserve">Equations (1) to (7) describe the program and the competition around it. Four more carry the answer back to the transport solver, and they are the ones a reader is most likely to assume rather than check.</w:t>
+      </w:r>
+    </w:p>
+    <w:p>
+      <w:pPr>
+        <w:spacing w:after="140" w:line="288" w:lineRule="auto"/>
+      </w:pPr>
+      <w:r>
+        <w:t xml:space="preserve">The chain of Section 6 is written there as a list of programs. As an equation it is one inequality per stage, imposed on the stages that come after it:</w:t>
+      </w:r>
+    </w:p>
+    <w:p>
+      <w:pPr>
+        <w:spacing w:before="40" w:after="140"/>
+        <w:jc w:val="center"/>
+      </w:pPr>
+      <w:r>
+        <w:rPr>
+          <w:i/>
+          <w:iCs/>
+          <w:sz w:val="24"/>
+          <w:szCs w:val="24"/>
+        </w:rPr>
+        <w:t xml:space="preserve">v</w:t>
+      </w:r>
+      <w:r>
+        <w:rPr>
+          <w:i/>
+          <w:iCs/>
+          <w:sz w:val="24"/>
+          <w:szCs w:val="24"/>
+          <w:vertAlign w:val="subscript"/>
+        </w:rPr>
+        <w:t xml:space="preserve">j</w:t>
+      </w:r>
+      <w:r>
+        <w:rPr>
+          <w:i/>
+          <w:iCs/>
+          <w:sz w:val="24"/>
+          <w:szCs w:val="24"/>
+        </w:rPr>
+        <w:t xml:space="preserve"> ≥ a</w:t>
+      </w:r>
+      <w:r>
+        <w:rPr>
+          <w:i/>
+          <w:iCs/>
+          <w:sz w:val="24"/>
+          <w:szCs w:val="24"/>
+          <w:vertAlign w:val="subscript"/>
+        </w:rPr>
+        <w:t xml:space="preserve">j</w:t>
+      </w:r>
+      <w:r>
+        <w:rPr>
+          <w:i/>
+          <w:iCs/>
+          <w:sz w:val="24"/>
+          <w:szCs w:val="24"/>
+        </w:rPr>
+        <w:t xml:space="preserve"> f</w:t>
+      </w:r>
+      <w:r>
+        <w:rPr>
+          <w:i/>
+          <w:iCs/>
+          <w:sz w:val="24"/>
+          <w:szCs w:val="24"/>
+          <w:vertAlign w:val="subscript"/>
+        </w:rPr>
+        <w:t xml:space="preserve">j</w:t>
+      </w:r>
+      <w:r>
+        <w:rPr>
+          <w:i/>
+          <w:iCs/>
+          <w:sz w:val="24"/>
+          <w:szCs w:val="24"/>
+        </w:rPr>
+        <w:t xml:space="preserve"> ,      for every stage j already solved</w:t>
+      </w:r>
+      <w:r>
+        <w:rPr>
+          <w:sz w:val="24"/>
+          <w:szCs w:val="24"/>
+        </w:rPr>
+        <w:t xml:space="preserve">        (8)</w:t>
+      </w:r>
+    </w:p>
+    <w:p>
+      <w:pPr>
+        <w:spacing w:after="140" w:line="288" w:lineRule="auto"/>
+        <w:ind w:left="260"/>
+      </w:pPr>
+      <w:r>
+        <w:rPr>
+          <w:b/>
+          <w:bCs/>
+        </w:rPr>
+        <w:t xml:space="preserve">where </w:t>
+      </w:r>
+      <w:r>
+        <w:rPr>
+          <w:i/>
+          <w:iCs/>
+        </w:rPr>
+        <w:t xml:space="preserve">f</w:t>
+      </w:r>
+      <w:r>
+        <w:rPr>
+          <w:i/>
+          <w:iCs/>
+          <w:vertAlign w:val="subscript"/>
+        </w:rPr>
+        <w:t xml:space="preserve">j</w:t>
+      </w:r>
+      <w:r>
+        <w:t xml:space="preserve"> what stage j reached when it was the objective, and </w:t>
+      </w:r>
+      <w:r>
+        <w:rPr>
+          <w:i/>
+          <w:iCs/>
+        </w:rPr>
+        <w:t xml:space="preserve">a</w:t>
+      </w:r>
+      <w:r>
+        <w:rPr>
+          <w:i/>
+          <w:iCs/>
+          <w:vertAlign w:val="subscript"/>
+        </w:rPr>
+        <w:t xml:space="preserve">j</w:t>
+      </w:r>
+      <w:r>
+        <w:t xml:space="preserve"> the fraction of it later stages must preserve. Because every objective in the chain is a single reaction column, this is a bound on a column rather than a constraint on a weighted sum, so no row is added, the matrix never changes, and the warm start survives. That is the whole reason n stages cost about 1.6 single solves rather than n of them.</w:t>
+      </w:r>
+    </w:p>
+    <w:p>
+      <w:pPr>
+        <w:spacing w:after="140" w:line="288" w:lineRule="auto"/>
+      </w:pPr>
+      <w:r>
+        <w:t xml:space="preserve">The fluxes come back in millimoles per gram of dry cells per hour, and the lattice carries moles per litre. One line reconciles them, over every organism present in the voxel:</w:t>
+      </w:r>
+    </w:p>
+    <w:p>
+      <w:pPr>
+        <w:spacing w:before="40" w:after="140"/>
+        <w:jc w:val="center"/>
+      </w:pPr>
+      <w:r>
+        <w:rPr>
+          <w:i/>
+          <w:iCs/>
+          <w:sz w:val="24"/>
+          <w:szCs w:val="24"/>
+        </w:rPr>
+        <w:t xml:space="preserve">ΔC</w:t>
+      </w:r>
+      <w:r>
+        <w:rPr>
+          <w:i/>
+          <w:iCs/>
+          <w:sz w:val="24"/>
+          <w:szCs w:val="24"/>
+          <w:vertAlign w:val="subscript"/>
+        </w:rPr>
+        <w:t xml:space="preserve">k</w:t>
+      </w:r>
+      <w:r>
+        <w:rPr>
+          <w:i/>
+          <w:iCs/>
+          <w:sz w:val="24"/>
+          <w:szCs w:val="24"/>
+        </w:rPr>
+        <w:t xml:space="preserve"> = Δt Σ</w:t>
+      </w:r>
+      <w:r>
+        <w:rPr>
+          <w:i/>
+          <w:iCs/>
+          <w:sz w:val="24"/>
+          <w:szCs w:val="24"/>
+          <w:vertAlign w:val="subscript"/>
+        </w:rPr>
+        <w:t xml:space="preserve">m</w:t>
+      </w:r>
+      <w:r>
+        <w:rPr>
+          <w:i/>
+          <w:iCs/>
+          <w:sz w:val="24"/>
+          <w:szCs w:val="24"/>
+        </w:rPr>
+        <w:t xml:space="preserve"> v</w:t>
+      </w:r>
+      <w:r>
+        <w:rPr>
+          <w:i/>
+          <w:iCs/>
+          <w:sz w:val="24"/>
+          <w:szCs w:val="24"/>
+          <w:vertAlign w:val="subscript"/>
+        </w:rPr>
+        <w:t xml:space="preserve">m,k</w:t>
+      </w:r>
+      <w:r>
+        <w:rPr>
+          <w:i/>
+          <w:iCs/>
+          <w:sz w:val="24"/>
+          <w:szCs w:val="24"/>
+        </w:rPr>
+        <w:t xml:space="preserve"> B</w:t>
+      </w:r>
+      <w:r>
+        <w:rPr>
+          <w:i/>
+          <w:iCs/>
+          <w:sz w:val="24"/>
+          <w:szCs w:val="24"/>
+          <w:vertAlign w:val="subscript"/>
+        </w:rPr>
+        <w:t xml:space="preserve">m</w:t>
+      </w:r>
+      <w:r>
+        <w:rPr>
+          <w:i/>
+          <w:iCs/>
+          <w:sz w:val="24"/>
+          <w:szCs w:val="24"/>
+        </w:rPr>
+        <w:t xml:space="preserve"> M</w:t>
+      </w:r>
+      <w:r>
+        <w:rPr>
+          <w:i/>
+          <w:iCs/>
+          <w:sz w:val="24"/>
+          <w:szCs w:val="24"/>
+        </w:rPr>
+        <w:t xml:space="preserve"> / 3.6 × 10</w:t>
+      </w:r>
+      <w:r>
+        <w:rPr>
+          <w:i/>
+          <w:iCs/>
+          <w:sz w:val="24"/>
+          <w:szCs w:val="24"/>
+          <w:vertAlign w:val="subscript"/>
+        </w:rPr>
+        <w:t xml:space="preserve">6</w:t>
+      </w:r>
+      <w:r>
+        <w:rPr>
+          <w:sz w:val="24"/>
+          <w:szCs w:val="24"/>
+        </w:rPr>
+        <w:t xml:space="preserve">        (9)</w:t>
+      </w:r>
+    </w:p>
+    <w:p>
+      <w:pPr>
+        <w:spacing w:after="140" w:line="288" w:lineRule="auto"/>
+        <w:ind w:left="260"/>
+      </w:pPr>
+      <w:r>
+        <w:rPr>
+          <w:b/>
+          <w:bCs/>
+        </w:rPr>
+        <w:t xml:space="preserve">where </w:t>
+      </w:r>
+      <w:r>
+        <w:rPr>
+          <w:i/>
+          <w:iCs/>
+        </w:rPr>
+        <w:t xml:space="preserve">B</w:t>
+      </w:r>
+      <w:r>
+        <w:rPr>
+          <w:i/>
+          <w:iCs/>
+          <w:vertAlign w:val="subscript"/>
+        </w:rPr>
+        <w:t xml:space="preserve">m</w:t>
+      </w:r>
+      <w:r>
+        <w:t xml:space="preserve"> the biomass of organism m in this voxel and </w:t>
+      </w:r>
+      <w:r>
+        <w:rPr>
+          <w:i/>
+          <w:iCs/>
+        </w:rPr>
+        <w:t xml:space="preserve">M</w:t>
+      </w:r>
+      <w:r>
+        <w:t xml:space="preserve"> its biomass molar mass, so their product is grams of dry cells per litre of water, which is what turns a per-gram flux into a per-litre rate. The sum runs over every organism, and the total is checked against what the voxel holds before it is applied: if it overruns, the organisms that wanted that substrate are given one pooled supply and solved again, at most three times, and then the draw is clamped rather than refused.</w:t>
+      </w:r>
+    </w:p>
+    <w:p>
+      <w:pPr>
+        <w:spacing w:after="140" w:line="288" w:lineRule="auto"/>
+      </w:pPr>
+      <w:r>
+        <w:t xml:space="preserve">If the thermodynamic gate of Method 5 is switched on and this organism carries a reaction block, the solved fluxes and the growth are scaled before equation (9) is applied for the last time:</w:t>
+      </w:r>
+    </w:p>
+    <w:p>
+      <w:pPr>
+        <w:spacing w:before="40" w:after="140"/>
+        <w:jc w:val="center"/>
+      </w:pPr>
+      <w:r>
+        <w:rPr>
+          <w:i/>
+          <w:iCs/>
+          <w:sz w:val="24"/>
+          <w:szCs w:val="24"/>
+        </w:rPr>
+        <w:t xml:space="preserve">v</w:t>
+      </w:r>
+      <w:r>
+        <w:rPr>
+          <w:i/>
+          <w:iCs/>
+          <w:sz w:val="24"/>
+          <w:szCs w:val="24"/>
+          <w:vertAlign w:val="subscript"/>
+        </w:rPr>
+        <w:t xml:space="preserve">k</w:t>
+      </w:r>
+      <w:r>
+        <w:rPr>
+          <w:i/>
+          <w:iCs/>
+          <w:sz w:val="24"/>
+          <w:szCs w:val="24"/>
+        </w:rPr>
+        <w:t xml:space="preserve"> ← F</w:t>
+      </w:r>
+      <w:r>
+        <w:rPr>
+          <w:i/>
+          <w:iCs/>
+          <w:sz w:val="24"/>
+          <w:szCs w:val="24"/>
+          <w:vertAlign w:val="subscript"/>
+        </w:rPr>
+        <w:t xml:space="preserve">T</w:t>
+      </w:r>
+      <w:r>
+        <w:rPr>
+          <w:i/>
+          <w:iCs/>
+          <w:sz w:val="24"/>
+          <w:szCs w:val="24"/>
+        </w:rPr>
+        <w:t xml:space="preserve"> v</w:t>
+      </w:r>
+      <w:r>
+        <w:rPr>
+          <w:i/>
+          <w:iCs/>
+          <w:sz w:val="24"/>
+          <w:szCs w:val="24"/>
+          <w:vertAlign w:val="subscript"/>
+        </w:rPr>
+        <w:t xml:space="preserve">k</w:t>
+      </w:r>
+      <w:r>
+        <w:rPr>
+          <w:i/>
+          <w:iCs/>
+          <w:sz w:val="24"/>
+          <w:szCs w:val="24"/>
+        </w:rPr>
+        <w:t xml:space="preserve"> ,      μ ← F</w:t>
+      </w:r>
+      <w:r>
+        <w:rPr>
+          <w:i/>
+          <w:iCs/>
+          <w:sz w:val="24"/>
+          <w:szCs w:val="24"/>
+          <w:vertAlign w:val="subscript"/>
+        </w:rPr>
+        <w:t xml:space="preserve">T</w:t>
+      </w:r>
+      <w:r>
+        <w:rPr>
+          <w:i/>
+          <w:iCs/>
+          <w:sz w:val="24"/>
+          <w:szCs w:val="24"/>
+        </w:rPr>
+        <w:t xml:space="preserve"> μ</w:t>
+      </w:r>
+      <w:r>
+        <w:rPr>
+          <w:sz w:val="24"/>
+          <w:szCs w:val="24"/>
+        </w:rPr>
+        <w:t xml:space="preserve">        (10)</w:t>
+      </w:r>
+    </w:p>
+    <w:p>
+      <w:pPr>
+        <w:spacing w:after="140" w:line="288" w:lineRule="auto"/>
+        <w:ind w:left="260"/>
+      </w:pPr>
+      <w:r>
+        <w:rPr>
+          <w:b/>
+          <w:bCs/>
+        </w:rPr>
+        <w:t xml:space="preserve">where </w:t>
+      </w:r>
+      <w:r>
+        <w:t xml:space="preserve">the factor multiplies the solved answer and not the bounds that produced it. A program asked for a smaller bound would redistribute its whole flux pattern and could return a different set of by-products, which is a modelling change; scaling the solution keeps the metabolic answer and asks only what fraction of it the local energy balance permits. It is also why the budget check above cannot be broken by the gate: scaling can only make the draw smaller.</w:t>
+      </w:r>
+    </w:p>
+    <w:p>
+      <w:pPr>
+        <w:spacing w:after="140" w:line="288" w:lineRule="auto"/>
+      </w:pPr>
+      <w:r>
+        <w:t xml:space="preserve">Last, the growth flux becomes a biomass increment, or, when the program returned none, a loss:</w:t>
+      </w:r>
+    </w:p>
+    <w:p>
+      <w:pPr>
+        <w:spacing w:before="40" w:after="140"/>
+        <w:jc w:val="center"/>
+      </w:pPr>
+      <w:r>
+        <w:rPr>
+          <w:i/>
+          <w:iCs/>
+          <w:sz w:val="24"/>
+          <w:szCs w:val="24"/>
+        </w:rPr>
+        <w:t xml:space="preserve">ΔB = μ B Δt / 3600      if μ ≠ 0 ,      ΔB = − b B Δt      if μ = 0</w:t>
+      </w:r>
+      <w:r>
+        <w:rPr>
+          <w:sz w:val="24"/>
+          <w:szCs w:val="24"/>
+        </w:rPr>
+        <w:t xml:space="preserve">        (11)</w:t>
+      </w:r>
+    </w:p>
+    <w:p>
+      <w:pPr>
+        <w:spacing w:after="140" w:line="288" w:lineRule="auto"/>
+        <w:ind w:left="260"/>
+      </w:pPr>
+      <w:r>
+        <w:rPr>
+          <w:b/>
+          <w:bCs/>
+        </w:rPr>
+        <w:t xml:space="preserve">where </w:t>
+      </w:r>
+      <w:r>
+        <w:rPr>
+          <w:i/>
+          <w:iCs/>
+        </w:rPr>
+        <w:t xml:space="preserve">b</w:t>
+      </w:r>
+      <w:r>
+        <w:t xml:space="preserve"> the decay coefficient. The two conversions differ by a factor of a thousand and are easy to confuse: the growth flux is per hour, because that is the unit a metabolic model works in, and the decay coefficient is per second, because that is the unit the transport solver works in. They have separate converters in the code for exactly that reason. An infeasible program takes the decay branch too, and is counted so that the run can say how often it happened.</w:t>
+      </w:r>
+    </w:p>
+    <w:p>
+      <w:pPr>
+        <w:spacing w:before="160" w:after="80"/>
+      </w:pPr>
+      <w:r>
+        <w:rPr>
+          <w:b/>
+          <w:bCs/>
+        </w:rPr>
+        <w:t xml:space="preserve">8.2  The order in which the code applies them</w:t>
+      </w:r>
+    </w:p>
+    <w:p>
+      <w:pPr>
+        <w:keepNext/>
+        <w:keepLines/>
+        <w:spacing w:after="140" w:line="288" w:lineRule="auto"/>
+      </w:pPr>
+      <w:r>
+        <w:t xml:space="preserve">Read down. The shape of this list is the argument for the method: everything that costs anything to build is above the last group, and the last group is the only part that runs more than once.</w:t>
+      </w:r>
+    </w:p>
+    <w:p>
+      <w:pPr>
+        <w:keepNext/>
+        <w:spacing w:after="60"/>
+      </w:pPr>
+    </w:p>
+    <w:p>
+      <w:pPr>
+        <w:keepNext/>
+        <w:keepLines/>
+        <w:spacing w:line="252" w:lineRule="auto"/>
+      </w:pPr>
+      <w:r>
+        <w:rPr>
+          <w:rFonts w:ascii="Consolas" w:eastAsia="Consolas" w:hAnsi="Consolas" w:cs="Consolas"/>
+          <w:sz w:val="17"/>
+          <w:szCs w:val="17"/>
+        </w:rPr>
+        <w:t xml:space="preserve">before the run                   write or obtain the metabolic model</w:t>
+      </w:r>
+    </w:p>
+    <w:p>
+      <w:pPr>
+        <w:keepNext/>
+        <w:keepLines/>
+        <w:spacing w:line="252" w:lineRule="auto"/>
+      </w:pPr>
+      <w:r>
+        <w:rPr>
+          <w:rFonts w:ascii="Consolas" w:eastAsia="Consolas" w:hAnsi="Consolas" w:cs="Consolas"/>
+          <w:sz w:val="17"/>
+          <w:szCs w:val="17"/>
+        </w:rPr>
+        <w:t xml:space="preserve">                                 name each exchange, and set its capacity</w:t>
+      </w:r>
+    </w:p>
+    <w:p>
+      <w:pPr>
+        <w:keepNext/>
+        <w:keepLines/>
+        <w:spacing w:line="252" w:lineRule="auto"/>
+      </w:pPr>
+      <w:r>
+        <w:rPr>
+          <w:rFonts w:ascii="Consolas" w:eastAsia="Consolas" w:hAnsi="Consolas" w:cs="Consolas"/>
+          <w:sz w:val="17"/>
+          <w:szCs w:val="17"/>
+        </w:rPr>
+        <w:t xml:space="preserve"/>
+      </w:r>
+    </w:p>
+    <w:p>
+      <w:pPr>
+        <w:keepNext/>
+        <w:keepLines/>
+        <w:spacing w:line="252" w:lineRule="auto"/>
+      </w:pPr>
+      <w:r>
+        <w:rPr>
+          <w:rFonts w:ascii="Consolas" w:eastAsia="Consolas" w:hAnsi="Consolas" w:cs="Consolas"/>
+          <w:sz w:val="17"/>
+          <w:szCs w:val="17"/>
+        </w:rPr>
+        <w:t xml:space="preserve">once, at start-up           1,2  the matrix and the fixed bounds, once</w:t>
+      </w:r>
+    </w:p>
+    <w:p>
+      <w:pPr>
+        <w:keepNext/>
+        <w:keepLines/>
+        <w:spacing w:line="252" w:lineRule="auto"/>
+      </w:pPr>
+      <w:r>
+        <w:rPr>
+          <w:rFonts w:ascii="Consolas" w:eastAsia="Consolas" w:hAnsi="Consolas" w:cs="Consolas"/>
+          <w:sz w:val="17"/>
+          <w:szCs w:val="17"/>
+        </w:rPr>
+        <w:t xml:space="preserve">  complab3d_metabolic.hh      4  the objective column, once</w:t>
+      </w:r>
+    </w:p>
+    <w:p>
+      <w:pPr>
+        <w:spacing w:line="252" w:lineRule="auto"/>
+      </w:pPr>
+      <w:r>
+        <w:rPr>
+          <w:rFonts w:ascii="Consolas" w:eastAsia="Consolas" w:hAnsi="Consolas" w:cs="Consolas"/>
+          <w:sz w:val="17"/>
+          <w:szCs w:val="17"/>
+        </w:rPr>
+        <w:t xml:space="preserve">                                 the column of every named exchange, by name</w:t>
+      </w:r>
+    </w:p>
+    <w:p>
+      <w:pPr>
+        <w:spacing w:after="60"/>
+      </w:pPr>
+    </w:p>
+    <w:p>
+      <w:pPr>
+        <w:keepNext/>
+        <w:keepLines/>
+        <w:spacing w:line="252" w:lineRule="auto"/>
+      </w:pPr>
+      <w:r>
+        <w:rPr>
+          <w:rFonts w:ascii="Consolas" w:eastAsia="Consolas" w:hAnsi="Consolas" w:cs="Consolas"/>
+          <w:sz w:val="17"/>
+          <w:szCs w:val="17"/>
+        </w:rPr>
+        <w:t xml:space="preserve">per organism, per voxel,</w:t>
+      </w:r>
+    </w:p>
+    <w:p>
+      <w:pPr>
+        <w:keepNext/>
+        <w:keepLines/>
+        <w:spacing w:line="252" w:lineRule="auto"/>
+      </w:pPr>
+      <w:r>
+        <w:rPr>
+          <w:rFonts w:ascii="Consolas" w:eastAsia="Consolas" w:hAnsi="Consolas" w:cs="Consolas"/>
+          <w:sz w:val="17"/>
+          <w:szCs w:val="17"/>
+        </w:rPr>
+        <w:t xml:space="preserve">per reaction step             3  the uptake bound Monod allows here</w:t>
+      </w:r>
+    </w:p>
+    <w:p>
+      <w:pPr>
+        <w:keepNext/>
+        <w:keepLines/>
+        <w:spacing w:line="252" w:lineRule="auto"/>
+      </w:pPr>
+      <w:r>
+        <w:rPr>
+          <w:rFonts w:ascii="Consolas" w:eastAsia="Consolas" w:hAnsi="Consolas" w:cs="Consolas"/>
+          <w:sz w:val="17"/>
+          <w:szCs w:val="17"/>
+        </w:rPr>
+        <w:t xml:space="preserve">  complab3d_processors_          held above the model's floor and the supply</w:t>
+      </w:r>
+    </w:p>
+    <w:p>
+      <w:pPr>
+        <w:keepNext/>
+        <w:keepLines/>
+        <w:spacing w:line="252" w:lineRule="auto"/>
+      </w:pPr>
+      <w:r>
+        <w:rPr>
+          <w:rFonts w:ascii="Consolas" w:eastAsia="Consolas" w:hAnsi="Consolas" w:cs="Consolas"/>
+          <w:sz w:val="17"/>
+          <w:szCs w:val="17"/>
+        </w:rPr>
+        <w:t xml:space="preserve">  fba.hh                    5,6  the weights, if &lt;cybernetic&gt; is on</w:t>
+      </w:r>
+    </w:p>
+    <w:p>
+      <w:pPr>
+        <w:keepNext/>
+        <w:keepLines/>
+        <w:spacing w:line="252" w:lineRule="auto"/>
+      </w:pPr>
+      <w:r>
+        <w:rPr>
+          <w:rFonts w:ascii="Consolas" w:eastAsia="Consolas" w:hAnsi="Consolas" w:cs="Consolas"/>
+          <w:sz w:val="17"/>
+          <w:szCs w:val="17"/>
+        </w:rPr>
+        <w:t xml:space="preserve">                                 one solve per source, the others shut</w:t>
+      </w:r>
+    </w:p>
+    <w:p>
+      <w:pPr>
+        <w:keepNext/>
+        <w:keepLines/>
+        <w:spacing w:line="252" w:lineRule="auto"/>
+      </w:pPr>
+      <w:r>
+        <w:rPr>
+          <w:rFonts w:ascii="Consolas" w:eastAsia="Consolas" w:hAnsi="Consolas" w:cs="Consolas"/>
+          <w:sz w:val="17"/>
+          <w:szCs w:val="17"/>
+        </w:rPr>
+        <w:t xml:space="preserve">                              4  maximise growth</w:t>
+      </w:r>
+    </w:p>
+    <w:p>
+      <w:pPr>
+        <w:keepNext/>
+        <w:keepLines/>
+        <w:spacing w:line="252" w:lineRule="auto"/>
+      </w:pPr>
+      <w:r>
+        <w:rPr>
+          <w:rFonts w:ascii="Consolas" w:eastAsia="Consolas" w:hAnsi="Consolas" w:cs="Consolas"/>
+          <w:sz w:val="17"/>
+          <w:szCs w:val="17"/>
+        </w:rPr>
+        <w:t xml:space="preserve">                              8  or a chain, each stage pinning one more</w:t>
+      </w:r>
+    </w:p>
+    <w:p>
+      <w:pPr>
+        <w:keepNext/>
+        <w:keepLines/>
+        <w:spacing w:line="252" w:lineRule="auto"/>
+      </w:pPr>
+      <w:r>
+        <w:rPr>
+          <w:rFonts w:ascii="Consolas" w:eastAsia="Consolas" w:hAnsi="Consolas" w:cs="Consolas"/>
+          <w:sz w:val="17"/>
+          <w:szCs w:val="17"/>
+        </w:rPr>
+        <w:t xml:space="preserve">                              7  blend the options, if &lt;cybernetic&gt; is on</w:t>
+      </w:r>
+    </w:p>
+    <w:p>
+      <w:pPr>
+        <w:keepNext/>
+        <w:keepLines/>
+        <w:spacing w:line="252" w:lineRule="auto"/>
+      </w:pPr>
+      <w:r>
+        <w:rPr>
+          <w:rFonts w:ascii="Consolas" w:eastAsia="Consolas" w:hAnsi="Consolas" w:cs="Consolas"/>
+          <w:sz w:val="17"/>
+          <w:szCs w:val="17"/>
+        </w:rPr>
+        <w:t xml:space="preserve">                              9  what every organism here would draw</w:t>
+      </w:r>
+    </w:p>
+    <w:p>
+      <w:pPr>
+        <w:keepNext/>
+        <w:keepLines/>
+        <w:spacing w:line="252" w:lineRule="auto"/>
+      </w:pPr>
+      <w:r>
+        <w:rPr>
+          <w:rFonts w:ascii="Consolas" w:eastAsia="Consolas" w:hAnsi="Consolas" w:cs="Consolas"/>
+          <w:sz w:val="17"/>
+          <w:szCs w:val="17"/>
+        </w:rPr>
+        <w:t xml:space="preserve">                                 if the total overruns, share and re-solve</w:t>
+      </w:r>
+    </w:p>
+    <w:p>
+      <w:pPr>
+        <w:keepNext/>
+        <w:keepLines/>
+        <w:spacing w:line="252" w:lineRule="auto"/>
+      </w:pPr>
+      <w:r>
+        <w:rPr>
+          <w:rFonts w:ascii="Consolas" w:eastAsia="Consolas" w:hAnsi="Consolas" w:cs="Consolas"/>
+          <w:sz w:val="17"/>
+          <w:szCs w:val="17"/>
+        </w:rPr>
+        <w:t xml:space="preserve">                             10  the thermodynamic factor, if the gate is on</w:t>
+      </w:r>
+    </w:p>
+    <w:p>
+      <w:pPr>
+        <w:keepNext/>
+        <w:keepLines/>
+        <w:spacing w:line="252" w:lineRule="auto"/>
+      </w:pPr>
+      <w:r>
+        <w:rPr>
+          <w:rFonts w:ascii="Consolas" w:eastAsia="Consolas" w:hAnsi="Consolas" w:cs="Consolas"/>
+          <w:sz w:val="17"/>
+          <w:szCs w:val="17"/>
+        </w:rPr>
+        <w:t xml:space="preserve">                              9  the draws again, from the gated fluxes</w:t>
+      </w:r>
+    </w:p>
+    <w:p>
+      <w:pPr>
+        <w:spacing w:line="252" w:lineRule="auto"/>
+      </w:pPr>
+      <w:r>
+        <w:rPr>
+          <w:rFonts w:ascii="Consolas" w:eastAsia="Consolas" w:hAnsi="Consolas" w:cs="Consolas"/>
+          <w:sz w:val="17"/>
+          <w:szCs w:val="17"/>
+        </w:rPr>
+        <w:t xml:space="preserve">                             11  growth into biomass, or decay</w:t>
+      </w:r>
+    </w:p>
+    <w:p>
+      <w:pPr>
+        <w:spacing w:after="60"/>
+      </w:pPr>
+    </w:p>
+    <w:p>
+      <w:pPr>
+        <w:spacing w:after="140" w:line="288" w:lineRule="auto"/>
+      </w:pPr>
+      <w:r>
+        <w:t xml:space="preserve">One matrix, built once. One number per substrate, moved per voxel. Two numbers read back. Everything else in this document is about what happens when that is not quite enough: when the answer is not unique, when the organism has a choice of substrate, when two organisms share a voxel, or when the energy does not add up.</w:t>
+      </w:r>
+    </w:p>
+    <w:p>
+      <w:pPr>
         <w:spacing w:before="260" w:after="120"/>
       </w:pPr>
       <w:r>
@@ -3048,7 +3453,7 @@
           <w:sz w:val="26"/>
           <w:szCs w:val="26"/>
         </w:rPr>
-        <w:t xml:space="preserve">8. A worked example: one voxel, step by step</w:t>
+        <w:t xml:space="preserve">9. A worked example: one voxel, step by step</w:t>
       </w:r>
     </w:p>
     <w:p>
@@ -3068,7 +3473,7 @@
           <w:b/>
           <w:bCs/>
         </w:rPr>
-        <w:t xml:space="preserve">8.1 Where every number in this example comes from</w:t>
+        <w:t xml:space="preserve">9.1 Where every number in this example comes from</w:t>
       </w:r>
     </w:p>
     <w:p>
@@ -3078,6 +3483,11 @@
       <w:r>
         <w:t xml:space="preserve">This is the part that is easy to lose, so it comes first. Some of the numbers below are the modeller's choices and sit in the configuration file. Some are properties of the organism's reaction list. The rest are the state of the simulation at the instant the reaction step begins, and those are the only ones that change from voxel to voxel.</w:t>
       </w:r>
+    </w:p>
+    <w:p>
+      <w:pPr>
+        <w:spacing w:after="60"/>
+      </w:pPr>
     </w:p>
     <w:tbl>
       <w:tblPr>
@@ -3782,7 +4192,7 @@
         <w:spacing w:after="140" w:line="288" w:lineRule="auto"/>
       </w:pPr>
       <w:r>
-        <w:t xml:space="preserve">The last three rows are the simulation. Everything above them is fixed for the whole run. Note that the two uptake capacities are in millimoles per gram of dry cells per hour, which is the unit metabolic models are written in, while the concentrations are in moles per litre of water, which is the unit a transport solver works in. Section 8.5 is where those two meet.</w:t>
+        <w:t xml:space="preserve">The last three rows are the simulation. Everything above them is fixed for the whole run. Note that the two uptake capacities are in millimoles per gram of dry cells per hour, which is the unit metabolic models are written in, while the concentrations are in moles per litre of water, which is the unit a transport solver works in. Section 9.5 is where those two meet.</w:t>
       </w:r>
     </w:p>
     <w:p>
@@ -3794,7 +4204,7 @@
           <w:b/>
           <w:bCs/>
         </w:rPr>
-        <w:t xml:space="preserve">8.2 The model, written out</w:t>
+        <w:t xml:space="preserve">9.2 The model, written out</w:t>
       </w:r>
     </w:p>
     <w:p>
@@ -3807,6 +4217,8 @@
     </w:p>
     <w:p>
       <w:pPr>
+        <w:keepNext/>
+        <w:keepLines/>
         <w:spacing w:line="252" w:lineRule="auto"/>
       </w:pPr>
       <w:r>
@@ -3820,6 +4232,8 @@
     </w:p>
     <w:p>
       <w:pPr>
+        <w:keepNext/>
+        <w:keepLines/>
         <w:spacing w:line="252" w:lineRule="auto"/>
       </w:pPr>
       <w:r>
@@ -3833,6 +4247,8 @@
     </w:p>
     <w:p>
       <w:pPr>
+        <w:keepNext/>
+        <w:keepLines/>
         <w:spacing w:line="252" w:lineRule="auto"/>
       </w:pPr>
       <w:r>
@@ -3867,6 +4283,8 @@
     </w:p>
     <w:p>
       <w:pPr>
+        <w:keepNext/>
+        <w:keepLines/>
         <w:spacing w:line="252" w:lineRule="auto"/>
       </w:pPr>
       <w:r>
@@ -3880,6 +4298,8 @@
     </w:p>
     <w:p>
       <w:pPr>
+        <w:keepNext/>
+        <w:keepLines/>
         <w:spacing w:line="252" w:lineRule="auto"/>
       </w:pPr>
       <w:r>
@@ -3893,6 +4313,8 @@
     </w:p>
     <w:p>
       <w:pPr>
+        <w:keepNext/>
+        <w:keepLines/>
         <w:spacing w:line="252" w:lineRule="auto"/>
       </w:pPr>
       <w:r>
@@ -3919,6 +4341,75 @@
     </w:p>
     <w:p>
       <w:pPr>
+        <w:spacing w:before="140" w:after="40"/>
+        <w:jc w:val="center"/>
+      </w:pPr>
+      <w:r>
+        <w:rPr>
+          <w:noProof/>
+        </w:rPr>
+        <w:drawing>
+          <wp:inline distT="0" distB="0" distL="0" distR="0">
+            <wp:extent cx="4100000" cy="6775789"/>
+            <wp:effectExtent l="0" t="0" r="0" b="0"/>
+            <wp:docPr id="643" name="Picture 643"/>
+            <wp:cNvGraphicFramePr>
+              <a:graphicFrameLocks xmlns:a="http://schemas.openxmlformats.org/drawingml/2006/main" noChangeAspect="1"/>
+            </wp:cNvGraphicFramePr>
+            <a:graphic xmlns:a="http://schemas.openxmlformats.org/drawingml/2006/main">
+              <a:graphicData uri="http://schemas.openxmlformats.org/drawingml/2006/picture">
+                <pic:pic xmlns:pic="http://schemas.openxmlformats.org/drawingml/2006/picture">
+                  <pic:nvPicPr>
+                    <pic:cNvPr id="0" name=""/>
+                    <pic:cNvPicPr/>
+                  </pic:nvPicPr>
+                  <pic:blipFill>
+                    <a:blip r:embed="rId91"/>
+                    <a:stretch>
+                      <a:fillRect/>
+                    </a:stretch>
+                  </pic:blipFill>
+                  <pic:spPr bwMode="auto">
+                    <a:xfrm>
+                      <a:off x="0" y="0"/>
+                      <a:ext cx="4100000" cy="6775789"/>
+                    </a:xfrm>
+                    <a:prstGeom prst="rect">
+                      <a:avLst/>
+                    </a:prstGeom>
+                  </pic:spPr>
+                </pic:pic>
+              </a:graphicData>
+            </a:graphic>
+          </wp:inline>
+        </w:drawing>
+      </w:r>
+    </w:p>
+    <w:p>
+      <w:pPr>
+        <w:spacing w:after="120"/>
+        <w:jc w:val="center"/>
+      </w:pPr>
+      <w:r>
+        <w:rPr>
+          <w:i/>
+          <w:iCs/>
+          <w:sz w:val="18"/>
+          <w:szCs w:val="18"/>
+        </w:rPr>
+        <w:t xml:space="preserve">Figure 8. One linear program, drawn, on two voxels of the same run. Every number is computed from the four constants in examples/09_fba_glpk, and the model is small enough that the program can be solved by hand and the solver's answer confirmed.</w:t>
+      </w:r>
+    </w:p>
+    <w:p>
+      <w:pPr>
+        <w:spacing w:after="140" w:line="288" w:lineRule="auto"/>
+      </w:pPr>
+      <w:r>
+        <w:t xml:space="preserve">The two voxels differ in the donor concentration and in nothing else, and that one difference moves which constraint is doing the work. In the fed voxel the acceptor limits, and the reason is stoichiometry rather than size: a turn of the growth reaction consumes one donor and half an acceptor, so an acceptor bound of 3.809524 buys twice as much growth as its own size suggests, and the two ceilings come out at 9.523810 and 7.619048. In the drawn-down voxel the donor's own ceiling has fallen to 2.857143 and it is the donor that binds; the acceptor uptake falls with it rather than staying at its capacity, because a cell has no use for an acceptor it cannot pair with a donor. The panel at the foot of the figure sweeps the donor across the whole range a run visits and shows where the two ceilings cross: at 0.16 moles per litre exactly, with the acceptor limiting above it and the donor below. A run whose domain straddles that concentration is a run in which the limiting substrate changes from one place to another, and nothing in a concentration field says so.</w:t>
+      </w:r>
+    </w:p>
+    <w:p>
+      <w:pPr>
         <w:spacing w:before="160" w:after="80"/>
       </w:pPr>
       <w:r>
@@ -3926,7 +4417,7 @@
           <w:b/>
           <w:bCs/>
         </w:rPr>
-        <w:t xml:space="preserve">8.3 Step 1: turn the concentrations into uptake bounds</w:t>
+        <w:t xml:space="preserve">9.3 Step 1: turn the concentrations into uptake bounds</w:t>
       </w:r>
     </w:p>
     <w:p>
@@ -4084,7 +4575,7 @@
           <w:b/>
           <w:bCs/>
         </w:rPr>
-        <w:t xml:space="preserve">8.4 Step 2: solve the linear program</w:t>
+        <w:t xml:space="preserve">9.4 Step 2: solve the linear program</w:t>
       </w:r>
     </w:p>
     <w:p>
@@ -4097,6 +4588,8 @@
     </w:p>
     <w:p>
       <w:pPr>
+        <w:keepNext/>
+        <w:keepLines/>
         <w:spacing w:line="252" w:lineRule="auto"/>
       </w:pPr>
       <w:r>
@@ -4110,6 +4603,8 @@
     </w:p>
     <w:p>
       <w:pPr>
+        <w:keepNext/>
+        <w:keepLines/>
         <w:spacing w:line="252" w:lineRule="auto"/>
       </w:pPr>
       <w:r>
@@ -4139,7 +4634,7 @@
         <w:spacing w:after="140" w:line="288" w:lineRule="auto"/>
       </w:pPr>
       <w:r>
-        <w:t xml:space="preserve">Every flux is now written in terms of the growth flux v3, which is what makes this model solvable by hand. Apply the two bounds from Section 8.3. The donor uptake v0 cannot be more negative than -9.523810, and v0 = -v3, so:</w:t>
+        <w:t xml:space="preserve">Every flux is now written in terms of the growth flux v3, which is what makes this model solvable by hand. Apply the two bounds from Section 9.3. The donor uptake v0 cannot be more negative than -9.523810, and v0 = -v3, so:</w:t>
       </w:r>
     </w:p>
     <w:p>
@@ -4288,6 +4783,8 @@
     </w:p>
     <w:p>
       <w:pPr>
+        <w:keepNext/>
+        <w:keepLines/>
         <w:spacing w:line="252" w:lineRule="auto"/>
       </w:pPr>
       <w:r>
@@ -4301,6 +4798,8 @@
     </w:p>
     <w:p>
       <w:pPr>
+        <w:keepNext/>
+        <w:keepLines/>
         <w:spacing w:line="252" w:lineRule="auto"/>
       </w:pPr>
       <w:r>
@@ -4314,6 +4813,8 @@
     </w:p>
     <w:p>
       <w:pPr>
+        <w:keepNext/>
+        <w:keepLines/>
         <w:spacing w:line="252" w:lineRule="auto"/>
       </w:pPr>
       <w:r>
@@ -4347,7 +4848,7 @@
           <w:b/>
           <w:bCs/>
         </w:rPr>
-        <w:t xml:space="preserve">8.5 Step 3: turn the fluxes back into what the lattice carries</w:t>
+        <w:t xml:space="preserve">9.5 Step 3: turn the fluxes back into what the lattice carries</w:t>
       </w:r>
     </w:p>
     <w:p>
@@ -4510,6 +5011,8 @@
     </w:p>
     <w:p>
       <w:pPr>
+        <w:keepNext/>
+        <w:keepLines/>
         <w:spacing w:line="252" w:lineRule="auto"/>
       </w:pPr>
       <w:r>
@@ -4551,7 +5054,7 @@
           <w:b/>
           <w:bCs/>
         </w:rPr>
-        <w:t xml:space="preserve">8.6 Step 4: grow the biomass</w:t>
+        <w:t xml:space="preserve">9.6 Step 4: grow the biomass</w:t>
       </w:r>
     </w:p>
     <w:p>
@@ -4641,7 +5144,7 @@
           <w:b/>
           <w:bCs/>
         </w:rPr>
-        <w:t xml:space="preserve">8.7 The same voxel later, when the donor has run down</w:t>
+        <w:t xml:space="preserve">9.7 The same voxel later, when the donor has run down</w:t>
       </w:r>
     </w:p>
     <w:p>
@@ -4774,8 +5277,13 @@
           <w:sz w:val="26"/>
           <w:szCs w:val="26"/>
         </w:rPr>
-        <w:t xml:space="preserve">9. What to check when it has run</w:t>
-      </w:r>
+        <w:t xml:space="preserve">10. What to check when it has run</w:t>
+      </w:r>
+    </w:p>
+    <w:p>
+      <w:pPr>
+        <w:spacing w:after="60"/>
+      </w:pPr>
     </w:p>
     <w:tbl>
       <w:tblPr>
@@ -5300,344 +5808,6 @@
                 <w:szCs w:val="19"/>
               </w:rPr>
               <w:t xml:space="preserve">add a &lt;multi_step&gt; chain, section 6</w:t>
-            </w:r>
-          </w:p>
-        </w:tc>
-      </w:tr>
-    </w:tbl>
-    <w:p/>
-    <w:p>
-      <w:pPr>
-        <w:spacing w:before="260" w:after="120"/>
-      </w:pPr>
-      <w:r>
-        <w:rPr>
-          <w:b/>
-          <w:bCs/>
-          <w:sz w:val="26"/>
-          <w:szCs w:val="26"/>
-        </w:rPr>
-        <w:t xml:space="preserve">10. Where to go next</w:t>
-      </w:r>
-    </w:p>
-    <w:tbl>
-      <w:tblPr>
-        <w:tblW w:w="9360" w:type="dxa"/>
-        <w:tblBorders>
-          <w:top w:val="single" w:sz="4" w:space="0" w:color="000000"/>
-          <w:left w:val="single" w:sz="4" w:space="0" w:color="000000"/>
-          <w:bottom w:val="single" w:sz="4" w:space="0" w:color="000000"/>
-          <w:right w:val="single" w:sz="4" w:space="0" w:color="000000"/>
-          <w:insideH w:val="single" w:sz="4" w:space="0" w:color="000000"/>
-          <w:insideV w:val="single" w:sz="4" w:space="0" w:color="000000"/>
-        </w:tblBorders>
-        <w:tblCellMar>
-          <w:left w:w="10" w:type="dxa"/>
-          <w:right w:w="10" w:type="dxa"/>
-        </w:tblCellMar>
-        <w:tblLook w:val="04A0" w:firstRow="1" w:lastRow="0" w:firstColumn="1" w:lastColumn="0" w:noHBand="0" w:noVBand="1"/>
-      </w:tblPr>
-      <w:tblGrid>
-        <w:gridCol w:w="2600"/>
-        <w:gridCol w:w="6800"/>
-      </w:tblGrid>
-      <w:tr>
-        <w:trPr>
-          <w:tblHeader/>
-        </w:trPr>
-        <w:tc>
-          <w:tcPr>
-            <w:tcW w:w="2600" w:type="dxa"/>
-            <w:tcMar>
-              <w:top w:w="40" w:type="dxa"/>
-              <w:left w:w="90" w:type="dxa"/>
-              <w:bottom w:w="40" w:type="dxa"/>
-              <w:right w:w="90" w:type="dxa"/>
-            </w:tcMar>
-          </w:tcPr>
-          <w:p>
-            <w:r>
-              <w:rPr>
-                <w:b/>
-                <w:bCs/>
-                <w:sz w:val="19"/>
-                <w:szCs w:val="19"/>
-              </w:rPr>
-              <w:t xml:space="preserve"/>
-            </w:r>
-          </w:p>
-        </w:tc>
-        <w:tc>
-          <w:tcPr>
-            <w:tcW w:w="6800" w:type="dxa"/>
-            <w:tcMar>
-              <w:top w:w="40" w:type="dxa"/>
-              <w:left w:w="90" w:type="dxa"/>
-              <w:bottom w:w="40" w:type="dxa"/>
-              <w:right w:w="90" w:type="dxa"/>
-            </w:tcMar>
-          </w:tcPr>
-          <w:p>
-            <w:r>
-              <w:rPr>
-                <w:b/>
-                <w:bCs/>
-                <w:sz w:val="19"/>
-                <w:szCs w:val="19"/>
-              </w:rPr>
-              <w:t xml:space="preserve"/>
-            </w:r>
-          </w:p>
-        </w:tc>
-      </w:tr>
-      <w:tr>
-        <w:tc>
-          <w:tcPr>
-            <w:tcW w:w="2600" w:type="dxa"/>
-            <w:tcMar>
-              <w:top w:w="40" w:type="dxa"/>
-              <w:left w:w="90" w:type="dxa"/>
-              <w:bottom w:w="40" w:type="dxa"/>
-              <w:right w:w="90" w:type="dxa"/>
-            </w:tcMar>
-          </w:tcPr>
-          <w:p>
-            <w:r>
-              <w:rPr>
-                <w:sz w:val="19"/>
-                <w:szCs w:val="19"/>
-              </w:rPr>
-              <w:t xml:space="preserve">the full method document</w:t>
-            </w:r>
-          </w:p>
-        </w:tc>
-        <w:tc>
-          <w:tcPr>
-            <w:tcW w:w="6800" w:type="dxa"/>
-            <w:tcMar>
-              <w:top w:w="40" w:type="dxa"/>
-              <w:left w:w="90" w:type="dxa"/>
-              <w:bottom w:w="40" w:type="dxa"/>
-              <w:right w:w="90" w:type="dxa"/>
-            </w:tcMar>
-          </w:tcPr>
-          <w:p>
-            <w:r>
-              <w:rPr>
-                <w:sz w:val="19"/>
-                <w:szCs w:val="19"/>
-              </w:rPr>
-              <w:t xml:space="preserve">Method 1, long form — the algorithm per voxel, the shared mass budget across organisms, the two back ends in detail, and the published coupling taxonomy</w:t>
-            </w:r>
-          </w:p>
-        </w:tc>
-      </w:tr>
-      <w:tr>
-        <w:tc>
-          <w:tcPr>
-            <w:tcW w:w="2600" w:type="dxa"/>
-            <w:tcMar>
-              <w:top w:w="40" w:type="dxa"/>
-              <w:left w:w="90" w:type="dxa"/>
-              <w:bottom w:w="40" w:type="dxa"/>
-              <w:right w:w="90" w:type="dxa"/>
-            </w:tcMar>
-          </w:tcPr>
-          <w:p>
-            <w:r>
-              <w:rPr>
-                <w:sz w:val="19"/>
-                <w:szCs w:val="19"/>
-              </w:rPr>
-              <w:t xml:space="preserve">example 09</w:t>
-            </w:r>
-          </w:p>
-        </w:tc>
-        <w:tc>
-          <w:tcPr>
-            <w:tcW w:w="6800" w:type="dxa"/>
-            <w:tcMar>
-              <w:top w:w="40" w:type="dxa"/>
-              <w:left w:w="90" w:type="dxa"/>
-              <w:bottom w:w="40" w:type="dxa"/>
-              <w:right w:w="90" w:type="dxa"/>
-            </w:tcMar>
-          </w:tcPr>
-          <w:p>
-            <w:r>
-              <w:rPr>
-                <w:sz w:val="19"/>
-                <w:szCs w:val="19"/>
-              </w:rPr>
-              <w:t xml:space="preserve">flux balance analysis through GLPK, smallest working case</w:t>
-            </w:r>
-          </w:p>
-        </w:tc>
-      </w:tr>
-      <w:tr>
-        <w:tc>
-          <w:tcPr>
-            <w:tcW w:w="2600" w:type="dxa"/>
-            <w:tcMar>
-              <w:top w:w="40" w:type="dxa"/>
-              <w:left w:w="90" w:type="dxa"/>
-              <w:bottom w:w="40" w:type="dxa"/>
-              <w:right w:w="90" w:type="dxa"/>
-            </w:tcMar>
-          </w:tcPr>
-          <w:p>
-            <w:r>
-              <w:rPr>
-                <w:sz w:val="19"/>
-                <w:szCs w:val="19"/>
-              </w:rPr>
-              <w:t xml:space="preserve">example 10</w:t>
-            </w:r>
-          </w:p>
-        </w:tc>
-        <w:tc>
-          <w:tcPr>
-            <w:tcW w:w="6800" w:type="dxa"/>
-            <w:tcMar>
-              <w:top w:w="40" w:type="dxa"/>
-              <w:left w:w="90" w:type="dxa"/>
-              <w:bottom w:w="40" w:type="dxa"/>
-              <w:right w:w="90" w:type="dxa"/>
-            </w:tcMar>
-          </w:tcPr>
-          <w:p>
-            <w:r>
-              <w:rPr>
-                <w:sz w:val="19"/>
-                <w:szCs w:val="19"/>
-              </w:rPr>
-              <w:t xml:space="preserve">the same case through COBRApy, as a cross-check</w:t>
-            </w:r>
-          </w:p>
-        </w:tc>
-      </w:tr>
-      <w:tr>
-        <w:tc>
-          <w:tcPr>
-            <w:tcW w:w="2600" w:type="dxa"/>
-            <w:tcMar>
-              <w:top w:w="40" w:type="dxa"/>
-              <w:left w:w="90" w:type="dxa"/>
-              <w:bottom w:w="40" w:type="dxa"/>
-              <w:right w:w="90" w:type="dxa"/>
-            </w:tcMar>
-          </w:tcPr>
-          <w:p>
-            <w:r>
-              <w:rPr>
-                <w:sz w:val="19"/>
-                <w:szCs w:val="19"/>
-              </w:rPr>
-              <w:t xml:space="preserve">example 21</w:t>
-            </w:r>
-          </w:p>
-        </w:tc>
-        <w:tc>
-          <w:tcPr>
-            <w:tcW w:w="6800" w:type="dxa"/>
-            <w:tcMar>
-              <w:top w:w="40" w:type="dxa"/>
-              <w:left w:w="90" w:type="dxa"/>
-              <w:bottom w:w="40" w:type="dxa"/>
-              <w:right w:w="90" w:type="dxa"/>
-            </w:tcMar>
-          </w:tcPr>
-          <w:p>
-            <w:r>
-              <w:rPr>
-                <w:sz w:val="19"/>
-                <w:szCs w:val="19"/>
-              </w:rPr>
-              <w:t xml:space="preserve">the multi-step chain of section 6</w:t>
-            </w:r>
-          </w:p>
-        </w:tc>
-      </w:tr>
-      <w:tr>
-        <w:tc>
-          <w:tcPr>
-            <w:tcW w:w="2600" w:type="dxa"/>
-            <w:tcMar>
-              <w:top w:w="40" w:type="dxa"/>
-              <w:left w:w="90" w:type="dxa"/>
-              <w:bottom w:w="40" w:type="dxa"/>
-              <w:right w:w="90" w:type="dxa"/>
-            </w:tcMar>
-          </w:tcPr>
-          <w:p>
-            <w:r>
-              <w:rPr>
-                <w:sz w:val="19"/>
-                <w:szCs w:val="19"/>
-              </w:rPr>
-              <w:t xml:space="preserve">example 22</w:t>
-            </w:r>
-          </w:p>
-        </w:tc>
-        <w:tc>
-          <w:tcPr>
-            <w:tcW w:w="6800" w:type="dxa"/>
-            <w:tcMar>
-              <w:top w:w="40" w:type="dxa"/>
-              <w:left w:w="90" w:type="dxa"/>
-              <w:bottom w:w="40" w:type="dxa"/>
-              <w:right w:w="90" w:type="dxa"/>
-            </w:tcMar>
-          </w:tcPr>
-          <w:p>
-            <w:r>
-              <w:rPr>
-                <w:sz w:val="19"/>
-                <w:szCs w:val="19"/>
-              </w:rPr>
-              <w:t xml:space="preserve">the metabolic switching of section 7</w:t>
-            </w:r>
-          </w:p>
-        </w:tc>
-      </w:tr>
-      <w:tr>
-        <w:tc>
-          <w:tcPr>
-            <w:tcW w:w="2600" w:type="dxa"/>
-            <w:tcMar>
-              <w:top w:w="40" w:type="dxa"/>
-              <w:left w:w="90" w:type="dxa"/>
-              <w:bottom w:w="40" w:type="dxa"/>
-              <w:right w:w="90" w:type="dxa"/>
-            </w:tcMar>
-          </w:tcPr>
-          <w:p>
-            <w:r>
-              <w:rPr>
-                <w:sz w:val="19"/>
-                <w:szCs w:val="19"/>
-              </w:rPr>
-              <w:t xml:space="preserve">config/CompLaB.reference.xml</w:t>
-            </w:r>
-          </w:p>
-        </w:tc>
-        <w:tc>
-          <w:tcPr>
-            <w:tcW w:w="6800" w:type="dxa"/>
-            <w:tcMar>
-              <w:top w:w="40" w:type="dxa"/>
-              <w:left w:w="90" w:type="dxa"/>
-              <w:bottom w:w="40" w:type="dxa"/>
-              <w:right w:w="90" w:type="dxa"/>
-            </w:tcMar>
-          </w:tcPr>
-          <w:p>
-            <w:r>
-              <w:rPr>
-                <w:sz w:val="19"/>
-                <w:szCs w:val="19"/>
-              </w:rPr>
-              <w:t xml:space="preserve">every tag documented once, including &lt;multi_step&gt; and &lt;cybernetic&gt;</w:t>
             </w:r>
           </w:p>
         </w:tc>

</xml_diff>